<commit_message>
Standardize thesis formatting and equation rendering
</commit_message>
<xml_diff>
--- a/01_Thesis/ESG-Adjusted Volatility Forecasts and Equity Option Trading.docx
+++ b/01_Thesis/ESG-Adjusted Volatility Forecasts and Equity Option Trading.docx
@@ -4720,382 +4720,170 @@
     </w:p>
     <w:p>
       <w:pPr>
-        <w:spacing w:after="200"/>
-      </w:pPr>
-      <w:r>
-        <w:rPr>
-          <w:i/>
-        </w:rPr>
-        <w:t>(Page references to be completed after final pagination is set in Word; select this list and press F9, or update manually before submission.)</w:t>
-      </w:r>
-    </w:p>
-    <w:p>
-      <w:pPr>
         <w:pStyle w:val="Heading2"/>
-        <w:spacing w:before="0" w:after="120"/>
-      </w:pPr>
-      <w:bookmarkStart w:id="3" w:name="_Toc241347555"/>
-      <w:r>
-        <w:t>List of Tables</w:t>
-      </w:r>
-      <w:bookmarkEnd w:id="3"/>
-    </w:p>
-    <w:p>
-      <w:pPr>
-        <w:spacing w:after="80"/>
-        <w:ind w:left="720" w:hanging="720"/>
-      </w:pPr>
-      <w:r>
-        <w:rPr>
-          <w:b/>
-        </w:rPr>
-        <w:t xml:space="preserve">Table 1. </w:t>
-      </w:r>
-      <w:r>
-        <w:t>Out-of-sample forecast accuracy by volatility model</w:t>
-      </w:r>
-      <w:r>
-        <w:tab/>
-        <w:t>[p. __]</w:t>
-      </w:r>
-    </w:p>
-    <w:p>
-      <w:pPr>
-        <w:spacing w:after="80"/>
-        <w:ind w:left="720" w:hanging="720"/>
-      </w:pPr>
-      <w:r>
-        <w:rPr>
-          <w:b/>
-        </w:rPr>
-        <w:t xml:space="preserve">Table 2. </w:t>
-      </w:r>
-      <w:r>
-        <w:t>Trade coverage by entry threshold</w:t>
-      </w:r>
-      <w:r>
-        <w:tab/>
-        <w:t>[p. __]</w:t>
-      </w:r>
-    </w:p>
-    <w:p>
-      <w:pPr>
-        <w:spacing w:after="80"/>
-        <w:ind w:left="720" w:hanging="720"/>
-      </w:pPr>
-      <w:r>
-        <w:rPr>
-          <w:b/>
-        </w:rPr>
-        <w:t xml:space="preserve">Table 3. </w:t>
-      </w:r>
-      <w:r>
-        <w:t>Benchmark trading performance by horizon</w:t>
-      </w:r>
-      <w:r>
-        <w:tab/>
-        <w:t>[p. __]</w:t>
-      </w:r>
-    </w:p>
-    <w:p>
-      <w:pPr>
-        <w:spacing w:after="80"/>
-        <w:ind w:left="720" w:hanging="720"/>
-      </w:pPr>
-      <w:r>
-        <w:rPr>
-          <w:b/>
-        </w:rPr>
-        <w:t xml:space="preserve">Table 4. </w:t>
-      </w:r>
-      <w:r>
-        <w:t>Black-76 straddle pricing and mispricing summary</w:t>
-      </w:r>
-      <w:r>
-        <w:tab/>
-        <w:t>[p. __]</w:t>
-      </w:r>
-    </w:p>
-    <w:p>
-      <w:pPr>
-        <w:spacing w:after="80"/>
-        <w:ind w:left="720" w:hanging="720"/>
-      </w:pPr>
-      <w:r>
-        <w:rPr>
-          <w:b/>
-        </w:rPr>
-        <w:t xml:space="preserve">Table B1. </w:t>
-      </w:r>
-      <w:r>
-        <w:t>Black-76 straddle pricing summary</w:t>
-      </w:r>
-      <w:r>
-        <w:tab/>
-        <w:t>[p. __]</w:t>
-      </w:r>
-    </w:p>
-    <w:p>
-      <w:pPr>
-        <w:spacing w:after="80"/>
-        <w:ind w:left="720" w:hanging="720"/>
-      </w:pPr>
-      <w:r>
-        <w:rPr>
-          <w:b/>
-        </w:rPr>
-        <w:t xml:space="preserve">Table B2. </w:t>
-      </w:r>
-      <w:r>
-        <w:t>Signed and absolute mispricing summary</w:t>
-      </w:r>
-      <w:r>
-        <w:tab/>
-        <w:t>[p. __]</w:t>
-      </w:r>
-    </w:p>
-    <w:p>
-      <w:pPr>
-        <w:spacing w:after="80"/>
-        <w:ind w:left="720" w:hanging="720"/>
-      </w:pPr>
-      <w:r>
-        <w:rPr>
-          <w:b/>
-        </w:rPr>
-        <w:t xml:space="preserve">Table B3. </w:t>
-      </w:r>
-      <w:r>
-        <w:t>Implied-volatility versus forecast-volatility diagnostics</w:t>
-      </w:r>
-      <w:r>
-        <w:tab/>
-        <w:t>[p. __]</w:t>
-      </w:r>
-    </w:p>
-    <w:p>
-      <w:pPr>
-        <w:spacing w:after="80"/>
-        <w:ind w:left="720" w:hanging="720"/>
-      </w:pPr>
-      <w:r>
-        <w:rPr>
-          <w:b/>
-        </w:rPr>
-        <w:t xml:space="preserve">Table C1. </w:t>
-      </w:r>
-      <w:r>
-        <w:t>Baseline realised P&amp;L by model and horizon</w:t>
-      </w:r>
-      <w:r>
-        <w:tab/>
-        <w:t>[p. __]</w:t>
-      </w:r>
-    </w:p>
-    <w:p>
-      <w:pPr>
-        <w:spacing w:after="80"/>
-        <w:ind w:left="720" w:hanging="720"/>
-      </w:pPr>
-      <w:r>
-        <w:rPr>
-          <w:b/>
-        </w:rPr>
-        <w:t xml:space="preserve">Table C2. </w:t>
-      </w:r>
-      <w:r>
-        <w:t>USD 1 million capital-normalised performance</w:t>
-      </w:r>
-      <w:r>
-        <w:tab/>
-        <w:t>[p. __]</w:t>
-      </w:r>
-    </w:p>
-    <w:p>
-      <w:pPr>
-        <w:spacing w:after="80"/>
-        <w:ind w:left="720" w:hanging="720"/>
-      </w:pPr>
-      <w:r>
-        <w:rPr>
-          <w:b/>
-        </w:rPr>
-        <w:t xml:space="preserve">Table C3. </w:t>
-      </w:r>
-      <w:r>
-        <w:t>Risk diagnostics</w:t>
-      </w:r>
-      <w:r>
-        <w:tab/>
-        <w:t>[p. __]</w:t>
-      </w:r>
-    </w:p>
-    <w:p>
-      <w:pPr>
-        <w:spacing w:after="80"/>
-        <w:ind w:left="720" w:hanging="720"/>
-      </w:pPr>
-      <w:r>
-        <w:rPr>
-          <w:b/>
-        </w:rPr>
-        <w:t xml:space="preserve">Table D1. </w:t>
-      </w:r>
-      <w:r>
-        <w:t>Threshold robustness summary</w:t>
-      </w:r>
-      <w:r>
-        <w:tab/>
-        <w:t>[p. __]</w:t>
-      </w:r>
-    </w:p>
-    <w:p>
-      <w:pPr>
-        <w:spacing w:after="80"/>
-        <w:ind w:left="720" w:hanging="720"/>
-      </w:pPr>
-      <w:r>
-        <w:rPr>
-          <w:b/>
-        </w:rPr>
-        <w:t xml:space="preserve">Table D2. </w:t>
-      </w:r>
-      <w:r>
-        <w:t>Holm-adjusted paired ESG-versus-benchmark P&amp;L tests</w:t>
-      </w:r>
-      <w:r>
-        <w:tab/>
-        <w:t>[p. __]</w:t>
-      </w:r>
-    </w:p>
-    <w:p>
-      <w:pPr>
-        <w:spacing w:after="80"/>
-      </w:pPr>
+      </w:pPr>
+      <w:r>
+        <w:t xml:space="preserve">List of Tables</w:t>
+      </w:r>
+    </w:p>
+    <w:p>
+      <w:pPr>
+        <w:pStyle w:val="BodyText2"/>
+      </w:pPr>
+      <w:r>
+        <w:t xml:space="preserve">Table 1. Out-of-sample forecast accuracy by volatility model	[p. __]</w:t>
+      </w:r>
+    </w:p>
+    <w:p>
+      <w:pPr>
+        <w:pStyle w:val="BodyText2"/>
+      </w:pPr>
+      <w:r>
+        <w:t xml:space="preserve">Table 2. Trade coverage by entry threshold	[p. __]</w:t>
+      </w:r>
+    </w:p>
+    <w:p>
+      <w:pPr>
+        <w:pStyle w:val="BodyText2"/>
+      </w:pPr>
+      <w:r>
+        <w:t xml:space="preserve">Table 3. Benchmark trading performance by horizon	[p. __]</w:t>
+      </w:r>
+    </w:p>
+    <w:p>
+      <w:pPr>
+        <w:pStyle w:val="BodyText2"/>
+      </w:pPr>
+      <w:r>
+        <w:t xml:space="preserve">Table 4. Black-76 straddle pricing and mispricing summary	[p. __]</w:t>
+      </w:r>
+    </w:p>
+    <w:p>
+      <w:pPr>
+        <w:pStyle w:val="BodyText2"/>
+      </w:pPr>
+      <w:r>
+        <w:t xml:space="preserve">Table A1. Final sample and empirical pipeline audit	[p. __]</w:t>
+      </w:r>
+    </w:p>
+    <w:p>
+      <w:pPr>
+        <w:pStyle w:val="BodyText2"/>
+      </w:pPr>
+      <w:r>
+        <w:t xml:space="preserve">Table B1. Black-76 straddle pricing summary	[p. __]</w:t>
+      </w:r>
+    </w:p>
+    <w:p>
+      <w:pPr>
+        <w:pStyle w:val="BodyText2"/>
+      </w:pPr>
+      <w:r>
+        <w:t xml:space="preserve">Table B2. Signed and absolute mispricing summary	[p. __]</w:t>
+      </w:r>
+    </w:p>
+    <w:p>
+      <w:pPr>
+        <w:pStyle w:val="BodyText2"/>
+      </w:pPr>
+      <w:r>
+        <w:t xml:space="preserve">Table B3. Implied-volatility versus forecast-volatility diagnostics	[p. __]</w:t>
+      </w:r>
+    </w:p>
+    <w:p>
+      <w:pPr>
+        <w:pStyle w:val="BodyText2"/>
+      </w:pPr>
+      <w:r>
+        <w:t xml:space="preserve">Table C1. Baseline realised P&amp;L by model and horizon	[p. __]</w:t>
+      </w:r>
+    </w:p>
+    <w:p>
+      <w:pPr>
+        <w:pStyle w:val="BodyText2"/>
+      </w:pPr>
+      <w:r>
+        <w:t xml:space="preserve">Table C2. USD 1 million capital-normalised performance	[p. __]</w:t>
+      </w:r>
+    </w:p>
+    <w:p>
+      <w:pPr>
+        <w:pStyle w:val="BodyText2"/>
+      </w:pPr>
+      <w:r>
+        <w:t xml:space="preserve">Table C3. Risk diagnostics	[p. __]</w:t>
+      </w:r>
+    </w:p>
+    <w:p>
+      <w:pPr>
+        <w:pStyle w:val="BodyText2"/>
+      </w:pPr>
+      <w:r>
+        <w:t xml:space="preserve">Table D1. Threshold robustness summary	[p. __]</w:t>
+      </w:r>
+    </w:p>
+    <w:p>
+      <w:pPr>
+        <w:pStyle w:val="BodyText2"/>
+      </w:pPr>
+      <w:r>
+        <w:t xml:space="preserve">Table D2. Holm-adjusted paired ESG-versus-benchmark P&amp;L tests	[p. __]</w:t>
+      </w:r>
     </w:p>
     <w:p>
       <w:pPr>
         <w:pStyle w:val="Heading2"/>
-        <w:spacing w:before="240" w:after="120"/>
-      </w:pPr>
-      <w:bookmarkStart w:id="4" w:name="_Toc241347556"/>
-      <w:r>
-        <w:t>List of Figures</w:t>
-      </w:r>
-      <w:bookmarkEnd w:id="4"/>
-    </w:p>
-    <w:p>
-      <w:pPr>
-        <w:spacing w:after="80"/>
-        <w:ind w:left="720" w:hanging="720"/>
-      </w:pPr>
-      <w:r>
-        <w:rPr>
-          <w:b/>
-        </w:rPr>
-        <w:t xml:space="preserve">Figure C1. </w:t>
-      </w:r>
-      <w:r>
-        <w:t>Total realised P&amp;L by model at the 10-day horizon.</w:t>
-      </w:r>
-      <w:r>
-        <w:tab/>
-        <w:t>[p. __]</w:t>
-      </w:r>
-    </w:p>
-    <w:p>
-      <w:pPr>
-        <w:spacing w:after="80"/>
-        <w:ind w:left="720" w:hanging="720"/>
-      </w:pPr>
-      <w:r>
-        <w:rPr>
-          <w:b/>
-        </w:rPr>
-        <w:t xml:space="preserve">Figure C2. </w:t>
-      </w:r>
-      <w:r>
-        <w:t>Total realised P&amp;L by model at the 20-day horizon.</w:t>
-      </w:r>
-      <w:r>
-        <w:tab/>
-        <w:t>[p. __]</w:t>
-      </w:r>
-    </w:p>
-    <w:p>
-      <w:pPr>
-        <w:spacing w:after="80"/>
-        <w:ind w:left="720" w:hanging="720"/>
-      </w:pPr>
-      <w:r>
-        <w:rPr>
-          <w:b/>
-        </w:rPr>
-        <w:t xml:space="preserve">Figure C3. </w:t>
-      </w:r>
-      <w:r>
-        <w:t>Cumulative return on the USD 1 million reference capital at the 10-day horizon.</w:t>
-      </w:r>
-      <w:r>
-        <w:tab/>
-        <w:t>[p. __]</w:t>
-      </w:r>
-    </w:p>
-    <w:p>
-      <w:pPr>
-        <w:spacing w:after="80"/>
-        <w:ind w:left="720" w:hanging="720"/>
-      </w:pPr>
-      <w:r>
-        <w:rPr>
-          <w:b/>
-        </w:rPr>
-        <w:t xml:space="preserve">Figure C4. </w:t>
-      </w:r>
-      <w:r>
-        <w:t>Maximum drawdown by model at the 10-day horizon.</w:t>
-      </w:r>
-      <w:r>
-        <w:tab/>
-        <w:t>[p. __]</w:t>
-      </w:r>
-    </w:p>
-    <w:p>
-      <w:pPr>
-        <w:spacing w:after="80"/>
-        <w:ind w:left="720" w:hanging="720"/>
-      </w:pPr>
-      <w:r>
-        <w:rPr>
-          <w:b/>
-        </w:rPr>
-        <w:t xml:space="preserve">Figure D1. </w:t>
-      </w:r>
-      <w:r>
-        <w:t>Mean model total P&amp;L across entry thresholds and horizons.</w:t>
-      </w:r>
-      <w:r>
-        <w:tab/>
-        <w:t>[p. __]</w:t>
-      </w:r>
-    </w:p>
-    <w:p>
-      <w:pPr>
-        <w:spacing w:after="80"/>
-        <w:ind w:left="720" w:hanging="720"/>
-      </w:pPr>
-      <w:r>
-        <w:rPr>
-          <w:b/>
-        </w:rPr>
-        <w:t xml:space="preserve">Figure D2. </w:t>
-      </w:r>
-      <w:r>
-        <w:t>Mean paired ESG-minus-benchmark P&amp;L difference by entry threshold.</w:t>
-      </w:r>
-      <w:r>
-        <w:tab/>
-        <w:t>[p. __]</w:t>
+      </w:pPr>
+      <w:r>
+        <w:t xml:space="preserve">List of Figures</w:t>
+      </w:r>
+    </w:p>
+    <w:p>
+      <w:pPr>
+        <w:pStyle w:val="BodyText2"/>
+      </w:pPr>
+      <w:r>
+        <w:t xml:space="preserve">Figure C1. Total realised P&amp;L by model at the 10-day horizon	[p. __]</w:t>
+      </w:r>
+    </w:p>
+    <w:p>
+      <w:pPr>
+        <w:pStyle w:val="BodyText2"/>
+      </w:pPr>
+      <w:r>
+        <w:t xml:space="preserve">Figure C2. Total realised P&amp;L by model at the 20-day horizon	[p. __]</w:t>
+      </w:r>
+    </w:p>
+    <w:p>
+      <w:pPr>
+        <w:pStyle w:val="BodyText2"/>
+      </w:pPr>
+      <w:r>
+        <w:t xml:space="preserve">Figure C3. Cumulative return on the USD 1 million reference capital at the 10-day horizon	[p. __]</w:t>
+      </w:r>
+    </w:p>
+    <w:p>
+      <w:pPr>
+        <w:pStyle w:val="BodyText2"/>
+      </w:pPr>
+      <w:r>
+        <w:t xml:space="preserve">Figure C4. Maximum drawdown by model at the 10-day horizon	[p. __]</w:t>
+      </w:r>
+    </w:p>
+    <w:p>
+      <w:pPr>
+        <w:pStyle w:val="BodyText2"/>
+      </w:pPr>
+      <w:r>
+        <w:t xml:space="preserve">Figure D1. Mean model total P&amp;L across entry thresholds and horizons	[p. __]</w:t>
+      </w:r>
+    </w:p>
+    <w:p>
+      <w:pPr>
+        <w:pStyle w:val="BodyText2"/>
+      </w:pPr>
+      <w:r>
+        <w:t xml:space="preserve">Figure D2. Mean paired ESG-minus-benchmark P&amp;L difference by entry threshold	[p. __]</w:t>
       </w:r>
     </w:p>
     <w:p>
@@ -6533,23 +6321,21 @@
       <w:pPr>
         <w:pStyle w:val="BodyText2"/>
       </w:pPr>
-      <w:r>
-        <w:t>The baseline volatility engine starts from the Generalised Autoregressive Conditional Heteroskedasticity model of Bollerslev (1986). Let r_t denote the daily log return, expressed in percentage units, and let epsilon_t = r_t - mu denote the innovation around the conditional mean. The conditional variance is h_t = Var(epsilon_t | F_{t-1}). The implemented GARCH(1,1) recursion is h_t = omega + alpha epsilon_(t-1)^2 + beta h_(t-1). Here omega is the long-run variance intercept, alpha is the ARCH or news coeffi</w:t>
-      </w:r>
-      <w:r>
-        <w:t>cient measuring the immediate response to a new squared shock, and beta is the GARCH persistence coefficient governing the carry-over of previously estimated variance.</w:t>
-      </w:r>
+      <m:oMath>
+        <m:r>
+          <m:t>hₜ = ω + αεₜ₋₁² + βhₜ₋₁</m:t>
+        </m:r>
+      </m:oMath>
     </w:p>
     <w:p>
       <w:pPr>
         <w:pStyle w:val="BodyText2"/>
       </w:pPr>
-      <w:r>
-        <w:t>The code estimates this model with the arch Python package using a constant conditional mean, Gaussian innovations, p=1, o=0 and q=1. The model is estimated recursively rather than once on the complete sample. This is essential because the thesis evaluates genuine out-of-sample information rather than a full-sample fitted variance. The one-day-ahead variance is subsequently converted to annualised volatility as sigma_(t+1)^ann = sqrt(h_hat_(t+1) x 252) / 100 because the return input is expressed in percenta</w:t>
-      </w:r>
-      <w:r>
-        <w:t>ge points.</w:t>
-      </w:r>
+      <m:oMath>
+        <m:r>
+          <m:t>σₜ₊₁ᵃⁿⁿ = √(ĥₜ₊₁ × 252) / 100</m:t>
+        </m:r>
+      </m:oMath>
     </w:p>
     <w:p>
       <w:pPr>
@@ -6571,12 +6357,11 @@
       <w:pPr>
         <w:pStyle w:val="BodyText2"/>
       </w:pPr>
-      <w:r>
-        <w:t>The second baseline family is the Glosten, Jagannathan and Runkle (1993) threshold model, commonly referred to as GJR-GARCH. Its purpose is to capture the asymmetry of equity volatility, whereby negative return shocks can have a different effect on future variance from positive shocks of the same magnitude. The implemented recursion is h_t = omega + alpha epsilon_(t-1)^2 + gamma I(epsilon_(t-1)&lt;0) epsilon_(t-1)^2 + beta h_(t-1). The additional coefficient gamma is therefore the leverage or asymmetry paramet</w:t>
-      </w:r>
-      <w:r>
-        <w:t>er.</w:t>
-      </w:r>
+      <m:oMath>
+        <m:r>
+          <m:t>hₜ = ω + αεₜ₋₁² + γI(εₜ₋₁ &lt; 0)εₜ₋₁² + βhₜ₋₁</m:t>
+        </m:r>
+      </m:oMath>
     </w:p>
     <w:p>
       <w:pPr>
@@ -6598,9 +6383,11 @@
       <w:pPr>
         <w:pStyle w:val="BodyText2"/>
       </w:pPr>
-      <w:r>
-        <w:t>The third family is the Exponential GARCH model of Nelson (1991). EGARCH models the logarithm of conditional variance rather than variance itself. The implemented recursion can be written ln(h_t) = omega + beta ln(h_(t-1)) + alpha(|z_(t-1)| - E|z|) + gamma z_(t-1), where z_(t-1) = epsilon_(t-1)/sqrt(h_(t-1)). Under the Gaussian innovation assumption, E|z| = sqrt(2/pi). Alpha captures the response to shock magnitude, while gamma captures the sign effect.</w:t>
-      </w:r>
+      <m:oMath>
+        <m:r>
+          <m:t>ln(hₜ) = ω + βln(hₜ₋₁) + α(|zₜ₋₁| − E|z|) + γzₜ₋₁</m:t>
+        </m:r>
+      </m:oMath>
     </w:p>
     <w:p>
       <w:pPr>
@@ -6630,9 +6417,11 @@
       <w:pPr>
         <w:pStyle w:val="BodyText2"/>
       </w:pPr>
-      <w:r>
-        <w:t>For each fitted volatility family j, the engine obtains the historical fitted conditional variance h_hat_t^(j), constructs y_t^(j) = ln(h_hat_t^(j)), and constructs the lagged variance state x_t^(j) = ln(h_hat_(t-1)^(j)). The composite ESG relation is y_t^(j) = c_j + phi_j x_t^(j) + delta_E,j E_t + delta_S,j S_t + delta_G,j G_t + u_t. The pillar-specific versions retain only one ESG variable. The ESG variables are standardised within the current training window rather than using future-sample moments.</w:t>
-      </w:r>
+      <m:oMath>
+        <m:r>
+          <m:t>yₜ⁽ʲ⁾ = cⱼ + φⱼxₜ⁽ʲ⁾ + δE,ⱼEₜ + δS,ⱼSₜ + δG,ⱼGₜ + uₜ</m:t>
+        </m:r>
+      </m:oMath>
     </w:p>
     <w:p>
       <w:pPr>
@@ -6689,17 +6478,21 @@
       <w:pPr>
         <w:pStyle w:val="BodyText2"/>
       </w:pPr>
-      <w:r>
-        <w:t>At each forecast date, the engine takes the latest fitted baseline variance state and the ESG value available under the lag convention. For a single-pillar model, the forecast equation is ln(h_hat_(t+1)^ESG) = c_hat_j + phi_hat_j ln(h_hat_t) + delta_hat_k,j Z_(k,t), where k denotes E, S or G. For the composite model, ln(h_hat_(t+1)^ESG) = c_hat_j + phi_hat_j ln(h_hat_t) + delta_hat_E,j Z_E,t + delta_hat_S,j Z_S,t + delta_hat_G,j Z_G,t.</w:t>
-      </w:r>
+      <m:oMath>
+        <m:r>
+          <m:t>ln(ĥₜ₊₁ᴱˢᴳ) = ĉⱼ + φ̂ⱼln(ĥₜ) + δ̂E,ⱼZᴱ,ₜ + δ̂S,ⱼZˢ,ₜ + δ̂G,ⱼZᴳ,ₜ</m:t>
+        </m:r>
+      </m:oMath>
     </w:p>
     <w:p>
       <w:pPr>
         <w:pStyle w:val="BodyText2"/>
       </w:pPr>
-      <w:r>
-        <w:t>The resulting log variance is transformed back as h_hat_(t+1)^ESG = exp(clip(ln(h_hat_(t+1)^ESG), -10, 5)). The upper bound of +5 implies an annualised volatility ceiling of approximately 193.4 percent. These bounds are numerical safeguards rather than economic assumptions about normal equity volatility. The lower bound prevents numerical underflow, while the upper bound limits pathological explosive forecasts.</w:t>
-      </w:r>
+      <m:oMath>
+        <m:r>
+          <m:t>ĥₜ₊₁ᴱˢᴳ = exp(clip(ln(ĥₜ₊₁ᴱˢᴳ), −10, 5))</m:t>
+        </m:r>
+      </m:oMath>
     </w:p>
     <w:p>
       <w:pPr>
@@ -6788,9 +6581,11 @@
       <w:pPr>
         <w:pStyle w:val="BodyText2"/>
       </w:pPr>
-      <w:r>
-        <w:t>The forecast target is the next-day realised variance proxy r_(t+1)^2, with returns expressed in percentage units. The primary loss is the squared variance forecast error, L_t = (r_(t+1)^2 - h_hat_(t+1))^2. Because the target and forecast are on the same variance scale, this loss permits direct pairwise comparison across all 15 specifications. Volatility-scale MAE and RMSE are complementary measures after taking the square root of the model variance forecast.</w:t>
-      </w:r>
+      <m:oMath>
+        <m:r>
+          <m:t>Lₜ = (rₜ₊₁² − ĥₜ₊₁)²</m:t>
+        </m:r>
+      </m:oMath>
     </w:p>
     <w:p>
       <w:pPr>
@@ -6823,9 +6618,11 @@
       <w:pPr>
         <w:pStyle w:val="BodyText2"/>
       </w:pPr>
-      <w:r>
-        <w:t>Once the one-day-ahead volatility forecasts are generated, they are carried into the option stage without re-estimating the forecasting models on option information. For a European call under Black-76, C = exp(-rT)[F N(d1) - K N(d2)], while P = exp(-rT)[K N(-d2) - F N(-d1)], with d1 = [ln(F/K) + 0.5 sigma^2 T] / (sigma sqrt(T)) and d2 = d1 - sigma sqrt(T). Here F is the observed LSEG forward price, K is strike, r is the risk-free proxy, T is time to maturity and sigma is the annualised forecast volatility.</w:t>
-      </w:r>
+      <m:oMath>
+        <m:r>
+          <m:t>C = e⁻ʳᵀ[F N(d₁) − K N(d₂)] ; P = e⁻ʳᵀ[K N(−d₂) − F N(−d₁)]</m:t>
+        </m:r>
+      </m:oMath>
     </w:p>
     <w:p>
       <w:pPr>
@@ -6855,12 +6652,11 @@
       <w:pPr>
         <w:pStyle w:val="BodyText2"/>
       </w:pPr>
-      <w:r>
-        <w:t>For each model, the trading signal begins with Gap_t = IV_t - sigma_hat_t. The gap is standardised using a rolling 252-observation standard deviation based only on information available before the trading date: Z_t = Gap_t / SD_252(Gap). A positive Z-score means that market-implied volatility is high relative to the model forecast and generates a short-volatility signal. A negative Z-score means that implied volatility is low relative to the forecast and generates a long-volatility signal. The baseline entr</w:t>
-      </w:r>
-      <w:r>
-        <w:t>y rule is |Z| &gt;= 1.5, with |Z| &gt;= 1.0 and |Z| &gt;= 2.0 used for threshold robustness.</w:t>
-      </w:r>
+      <m:oMath>
+        <m:r>
+          <m:t>Gapₜ = IVₜ − σ̂ₜ ;  Zₜ = Gapₜ / SD₂₅₂(Gap)</m:t>
+        </m:r>
+      </m:oMath>
     </w:p>
     <w:p>
       <w:pPr>
@@ -6882,12 +6678,11 @@
       <w:pPr>
         <w:pStyle w:val="BodyText2"/>
       </w:pPr>
-      <w:r>
-        <w:t>The trading implementation separates two risk-neutralisation objectives. Delta hedging controls first-order exposure to movements in the underlying equity, whereas vega hedging controls first-order exposure to changes in implied volatility. They are therefore not substitutes. If the target straddle has vega V1 and the longer-maturity hedge straddle has vega V2, the hedge ratio is h = V1 / V2 and the hedge is taken in the opposite direction. The combined position then has approximately zero net vega at entry</w:t>
-      </w:r>
-      <w:r>
-        <w:t>: V_net = V1 - h V2 approximately equals zero.</w:t>
-      </w:r>
+      <m:oMath>
+        <m:r>
+          <m:t>Vₙₑₜ = V₁ − hV₂ ≈ 0 ;  h = V₁ / V₂</m:t>
+        </m:r>
+      </m:oMath>
     </w:p>
     <w:p>
       <w:pPr>

</xml_diff>